<commit_message>
Refine final Project Chattala copy
Co-authored-by: AHM Sadaf Mahmud <sadafbabu@users.noreply.github.com>
</commit_message>
<xml_diff>
--- a/deliverables/PROJECT_CHATTALA_Main_Edited.docx
+++ b/deliverables/PROJECT_CHATTALA_Main_Edited.docx
@@ -35,7 +35,7 @@
         <w:t>Project Chattala: Beyond the Flood</w:t>
       </w:r>
       <w:r>
-        <w:t xml:space="preserve"> in Banshkhali, Chattogram. The project focused on 70 families in remote areas. Many had lost their homes, had little or no reliable income and had received no earlier assistance because their communities were difficult to reach. Each household received a relief package tailored to its immediate needs.</w:t>
+        <w:t xml:space="preserve"> in Banshkhali, Chattogram. The project focused on 70 families in remote areas. Many had lost their homes, had little or no reliable income and had received no earlier assistance because their communities were difficult to reach. Each household received a standardised relief package designed to address immediate needs.</w:t>
       </w:r>
     </w:p>
     <w:p>
@@ -1062,7 +1062,7 @@
     </w:p>
     <w:p>
       <w:r>
-        <w:t>A six-member volunteer team left Dhaka at 10:00 PM and travelled overnight, arriving in Chattogram at 8:00 AM the following morning. After a brief period of preparation, the team loaded the supplies into a pickup truck at 9:30 AM and reached the affected communities at around 1:00 PM. Over the next 12 hours, the volunteers distributed relief packages to all 70 selected families.</w:t>
+        <w:t>A six-member volunteer team left Dhaka at 10:00 PM and travelled overnight, arriving in Chattogram at 8:00 AM the following morning. After a brief period of preparation, the team loaded the supplies into a pickup truck at 9:30 AM and reached the affected communities at around 1:00 PM. For more than 12 hours, the volunteers distributed relief packages to all 70 selected families.</w:t>
       </w:r>
     </w:p>
     <w:p>
@@ -1114,7 +1114,7 @@
         <w:rPr>
           <w:b/>
         </w:rPr>
-        <w:t>More than 280 people reached</w:t>
+        <w:t>Approximately 280 people reached</w:t>
       </w:r>
       <w:r>
         <w:t>, based on an average household size of four.</w:t>
@@ -1128,10 +1128,10 @@
         <w:rPr>
           <w:b/>
         </w:rPr>
-        <w:t>BDT 929 in supplies per package</w:t>
+        <w:t>BDT 929 estimated value per package</w:t>
       </w:r>
       <w:r>
-        <w:t>, with an additional BDT 4,970 spent on transportation.</w:t>
+        <w:t>, with BDT 4,970 spent on transportation in total.</w:t>
       </w:r>
     </w:p>
     <w:p>

</xml_diff>